<commit_message>
Round-2 review: fix C3/contralateral-ERD wording and topomap description; add group ERD (Fig 5) to report; add step2 guide
</commit_message>
<xml_diff>
--- a/results/step5/技术报告.docx
+++ b/results/step5/技术报告.docx
@@ -263,7 +263,7 @@
           <w:b w:val="0"/>
           <w:sz w:val="22"/>
         </w:rPr>
-        <w:t>信号层面（单被试示例，图 1）：在 C3/C4 可见运动想象相关的节律功率变化，仅作示例。</w:t>
+        <w:t>信号层面（图 1，单被试示例）：在 sub-001 第 1 次采集上可见运动想象相关的节律功率变化，右手想象时对侧 C3 的 mu+beta 功率下降（相对整段平均 −3.7%）强于同侧 C4（−1.9%），左手想象时对侧 C4（−1.0%）强于同侧 C3（+0.4%），呈现对侧 ERD（事件相关去同步）的雏形；此图仅作单被试示例。</w:t>
       </w:r>
     </w:p>
     <w:p>
@@ -314,7 +314,7 @@
           <w:rFonts w:eastAsia="宋体"/>
           <w:sz w:val="18"/>
         </w:rPr>
-        <w:t>图 1  单被试示例：sub-001 第 1 次采集 C3/C4 在左右手想象下的时频图（相对整段平均的百分比变化）</w:t>
+        <w:t>图 1  sub-001 第 1 次采集：C3/C4 在左右手想象下的时频图（相对整段平均的百分比变化）</w:t>
       </w:r>
     </w:p>
     <w:p>
@@ -327,7 +327,199 @@
           <w:b w:val="0"/>
           <w:sz w:val="22"/>
         </w:rPr>
-        <w:t>群体对侧 ERD（图 2）：对 51 名被试 × 3 次采集，在运动想象 0.5–2.5 s 窗内，以“右手−左手”的 mu/beta log 功率差衡量。C4（右半球）显著（mu p=0.014、beta p=3.3e-5，70–78% 被试方向一致）；C3（左半球）方向符合预期但未达显著。全脑地形图呈左蓝右红的对侧模式。</w:t>
+        <w:t>同一次采集内（表 1、图 2）：51 名被试平均准确率 0.5904 ± 0.1220；不足 60% 的被试 36 名（70.6%）。论文报告的 2C 数据 CSP+SVM 平均为 61.12%，本文结果与之接近。</w:t>
+      </w:r>
+    </w:p>
+    <w:p>
+      <w:pPr>
+        <w:jc w:val="center"/>
+      </w:pPr>
+      <w:r>
+        <w:drawing>
+          <wp:inline xmlns:a="http://schemas.openxmlformats.org/drawingml/2006/main" xmlns:pic="http://schemas.openxmlformats.org/drawingml/2006/picture">
+            <wp:extent cx="5669280" cy="2024743"/>
+            <wp:docPr id="2" name="Picture 2"/>
+            <wp:cNvGraphicFramePr>
+              <a:graphicFrameLocks noChangeAspect="1"/>
+            </wp:cNvGraphicFramePr>
+            <a:graphic>
+              <a:graphicData uri="http://schemas.openxmlformats.org/drawingml/2006/picture">
+                <pic:pic>
+                  <pic:nvPicPr>
+                    <pic:cNvPr id="0" name="within_session.png"/>
+                    <pic:cNvPicPr/>
+                  </pic:nvPicPr>
+                  <pic:blipFill>
+                    <a:blip r:embed="rId10"/>
+                    <a:stretch>
+                      <a:fillRect/>
+                    </a:stretch>
+                  </pic:blipFill>
+                  <pic:spPr>
+                    <a:xfrm>
+                      <a:off x="0" y="0"/>
+                      <a:ext cx="5669280" cy="2024743"/>
+                    </a:xfrm>
+                    <a:prstGeom prst="rect"/>
+                  </pic:spPr>
+                </pic:pic>
+              </a:graphicData>
+            </a:graphic>
+          </wp:inline>
+        </w:drawing>
+      </w:r>
+    </w:p>
+    <w:p>
+      <w:pPr>
+        <w:jc w:val="center"/>
+      </w:pPr>
+      <w:r>
+        <w:rPr>
+          <w:rFonts w:eastAsia="宋体"/>
+          <w:sz w:val="18"/>
+        </w:rPr>
+        <w:t>图 2  全部被试 within-session CSP+LDA 准确率（按准确率排序）</w:t>
+      </w:r>
+    </w:p>
+    <w:p>
+      <w:pPr>
+        <w:spacing w:after="120"/>
+      </w:pPr>
+      <w:r>
+        <w:rPr>
+          <w:rFonts w:ascii="Times New Roman" w:hAnsi="Times New Roman" w:eastAsia="宋体"/>
+          <w:b w:val="0"/>
+          <w:sz w:val="22"/>
+        </w:rPr>
+        <w:t>跨天迁移（表 2、图 3）：同一次采集内平均 0.5904；跨天直接迁移降至 0.5255 ± 0.0661（接近随机水平）；加入目标采集前 20% 试次适应后回升至 0.5718 ± 0.1091，用少量当次数据即可补回约 4.6 个百分点。</w:t>
+      </w:r>
+    </w:p>
+    <w:p>
+      <w:pPr>
+        <w:jc w:val="center"/>
+      </w:pPr>
+      <w:r>
+        <w:drawing>
+          <wp:inline xmlns:a="http://schemas.openxmlformats.org/drawingml/2006/main" xmlns:pic="http://schemas.openxmlformats.org/drawingml/2006/picture">
+            <wp:extent cx="5669280" cy="4049486"/>
+            <wp:docPr id="3" name="Picture 3"/>
+            <wp:cNvGraphicFramePr>
+              <a:graphicFrameLocks noChangeAspect="1"/>
+            </wp:cNvGraphicFramePr>
+            <a:graphic>
+              <a:graphicData uri="http://schemas.openxmlformats.org/drawingml/2006/picture">
+                <pic:pic>
+                  <pic:nvPicPr>
+                    <pic:cNvPr id="0" name="cross_session.png"/>
+                    <pic:cNvPicPr/>
+                  </pic:nvPicPr>
+                  <pic:blipFill>
+                    <a:blip r:embed="rId11"/>
+                    <a:stretch>
+                      <a:fillRect/>
+                    </a:stretch>
+                  </pic:blipFill>
+                  <pic:spPr>
+                    <a:xfrm>
+                      <a:off x="0" y="0"/>
+                      <a:ext cx="5669280" cy="4049486"/>
+                    </a:xfrm>
+                    <a:prstGeom prst="rect"/>
+                  </pic:spPr>
+                </pic:pic>
+              </a:graphicData>
+            </a:graphic>
+          </wp:inline>
+        </w:drawing>
+      </w:r>
+    </w:p>
+    <w:p>
+      <w:pPr>
+        <w:jc w:val="center"/>
+      </w:pPr>
+      <w:r>
+        <w:rPr>
+          <w:rFonts w:eastAsia="宋体"/>
+          <w:sz w:val="18"/>
+        </w:rPr>
+        <w:t>图 3  同一次采集内 vs 跨天直接迁移 vs 跨天+少量适应</w:t>
+      </w:r>
+    </w:p>
+    <w:p>
+      <w:pPr>
+        <w:spacing w:after="120"/>
+      </w:pPr>
+      <w:r>
+        <w:rPr>
+          <w:rFonts w:ascii="Times New Roman" w:hAnsi="Times New Roman" w:eastAsia="宋体"/>
+          <w:b w:val="0"/>
+          <w:sz w:val="22"/>
+        </w:rPr>
+        <w:t>FBCSP 对比（表 3、图 4）：FBCSP+LDA 平均 0.6087 ± 0.1172，高于 CSP+LDA 的 0.5904 ± 0.1220；Wilcoxon 符号秩检验 p = 0.0366，差异具有统计学意义。论文报告的 FBCSP+SVM 为 67.46%。</w:t>
+      </w:r>
+    </w:p>
+    <w:p>
+      <w:pPr>
+        <w:jc w:val="center"/>
+      </w:pPr>
+      <w:r>
+        <w:drawing>
+          <wp:inline xmlns:a="http://schemas.openxmlformats.org/drawingml/2006/main" xmlns:pic="http://schemas.openxmlformats.org/drawingml/2006/picture">
+            <wp:extent cx="5669280" cy="2362200"/>
+            <wp:docPr id="4" name="Picture 4"/>
+            <wp:cNvGraphicFramePr>
+              <a:graphicFrameLocks noChangeAspect="1"/>
+            </wp:cNvGraphicFramePr>
+            <a:graphic>
+              <a:graphicData uri="http://schemas.openxmlformats.org/drawingml/2006/picture">
+                <pic:pic>
+                  <pic:nvPicPr>
+                    <pic:cNvPr id="0" name="fbcsp_vs_csp.png"/>
+                    <pic:cNvPicPr/>
+                  </pic:nvPicPr>
+                  <pic:blipFill>
+                    <a:blip r:embed="rId12"/>
+                    <a:stretch>
+                      <a:fillRect/>
+                    </a:stretch>
+                  </pic:blipFill>
+                  <pic:spPr>
+                    <a:xfrm>
+                      <a:off x="0" y="0"/>
+                      <a:ext cx="5669280" cy="2362200"/>
+                    </a:xfrm>
+                    <a:prstGeom prst="rect"/>
+                  </pic:spPr>
+                </pic:pic>
+              </a:graphicData>
+            </a:graphic>
+          </wp:inline>
+        </w:drawing>
+      </w:r>
+    </w:p>
+    <w:p>
+      <w:pPr>
+        <w:jc w:val="center"/>
+      </w:pPr>
+      <w:r>
+        <w:rPr>
+          <w:rFonts w:eastAsia="宋体"/>
+          <w:sz w:val="18"/>
+        </w:rPr>
+        <w:t>图 4  每名被试 CSP vs FBCSP（配对连线），Wilcoxon p = 0.0366</w:t>
+      </w:r>
+    </w:p>
+    <w:p>
+      <w:pPr>
+        <w:spacing w:after="120"/>
+      </w:pPr>
+      <w:r>
+        <w:rPr>
+          <w:rFonts w:ascii="Times New Roman" w:hAnsi="Times New Roman" w:eastAsia="宋体"/>
+          <w:b w:val="0"/>
+          <w:sz w:val="22"/>
+        </w:rPr>
+        <w:t>群体水平对侧 ERD（图 5）：对全部 51 名被试 × 3 次采集，在运动想象 0.5–2.5 s 窗内以“右手−左手”的 mu/beta log 功率差检验对侧 ERD。单电极层面只有 C4 显示显著的对侧效应（mu p=0.014、beta p=3.3e-5，70–78% 被试方向一致）；C3 没有一致的对侧效应（mu 中位数方向相反，43% 被试方向一致，p=0.34）。左右半球不对称的原因尚不清楚，可能与 Pz 参考、个体差异或左手想象更容易诱发有关，这是可以继续检验的问题。群体均值地形图（图 5）上 mu 频段呈左负右正的对侧模式（左侧峰值偏 C3 后方），beta 频段主要表现为右半球效应；均值图与单电极中位数检验不完全一致，说明效应在被试间差异较大。</w:t>
       </w:r>
     </w:p>
     <w:p>
@@ -338,7 +530,7 @@
         <w:drawing>
           <wp:inline xmlns:a="http://schemas.openxmlformats.org/drawingml/2006/main" xmlns:pic="http://schemas.openxmlformats.org/drawingml/2006/picture">
             <wp:extent cx="5669280" cy="2551176"/>
-            <wp:docPr id="2" name="Picture 2"/>
+            <wp:docPr id="5" name="Picture 5"/>
             <wp:cNvGraphicFramePr>
               <a:graphicFrameLocks noChangeAspect="1"/>
             </wp:cNvGraphicFramePr>
@@ -350,7 +542,7 @@
                     <pic:cNvPicPr/>
                   </pic:nvPicPr>
                   <pic:blipFill>
-                    <a:blip r:embed="rId10"/>
+                    <a:blip r:embed="rId13"/>
                     <a:stretch>
                       <a:fillRect/>
                     </a:stretch>
@@ -378,199 +570,7 @@
           <w:rFonts w:eastAsia="宋体"/>
           <w:sz w:val="18"/>
         </w:rPr>
-        <w:t>图 2  群体平均（n=51）：右手想象 − 左手想象的 mu/beta log 功率差地形图</w:t>
-      </w:r>
-    </w:p>
-    <w:p>
-      <w:pPr>
-        <w:spacing w:after="120"/>
-      </w:pPr>
-      <w:r>
-        <w:rPr>
-          <w:rFonts w:ascii="Times New Roman" w:hAnsi="Times New Roman" w:eastAsia="宋体"/>
-          <w:b w:val="0"/>
-          <w:sz w:val="22"/>
-        </w:rPr>
-        <w:t>同一次采集内（表 1、图 3）：51 名被试平均准确率 0.5904 ± 0.1220；不足 60% 的被试 36 名（70.6%）。论文报告的 2C 数据 CSP+SVM 平均为 61.12%，本文结果与之接近。</w:t>
-      </w:r>
-    </w:p>
-    <w:p>
-      <w:pPr>
-        <w:jc w:val="center"/>
-      </w:pPr>
-      <w:r>
-        <w:drawing>
-          <wp:inline xmlns:a="http://schemas.openxmlformats.org/drawingml/2006/main" xmlns:pic="http://schemas.openxmlformats.org/drawingml/2006/picture">
-            <wp:extent cx="5669280" cy="2024743"/>
-            <wp:docPr id="3" name="Picture 3"/>
-            <wp:cNvGraphicFramePr>
-              <a:graphicFrameLocks noChangeAspect="1"/>
-            </wp:cNvGraphicFramePr>
-            <a:graphic>
-              <a:graphicData uri="http://schemas.openxmlformats.org/drawingml/2006/picture">
-                <pic:pic>
-                  <pic:nvPicPr>
-                    <pic:cNvPr id="0" name="within_session.png"/>
-                    <pic:cNvPicPr/>
-                  </pic:nvPicPr>
-                  <pic:blipFill>
-                    <a:blip r:embed="rId11"/>
-                    <a:stretch>
-                      <a:fillRect/>
-                    </a:stretch>
-                  </pic:blipFill>
-                  <pic:spPr>
-                    <a:xfrm>
-                      <a:off x="0" y="0"/>
-                      <a:ext cx="5669280" cy="2024743"/>
-                    </a:xfrm>
-                    <a:prstGeom prst="rect"/>
-                  </pic:spPr>
-                </pic:pic>
-              </a:graphicData>
-            </a:graphic>
-          </wp:inline>
-        </w:drawing>
-      </w:r>
-    </w:p>
-    <w:p>
-      <w:pPr>
-        <w:jc w:val="center"/>
-      </w:pPr>
-      <w:r>
-        <w:rPr>
-          <w:rFonts w:eastAsia="宋体"/>
-          <w:sz w:val="18"/>
-        </w:rPr>
-        <w:t>图 3  全部被试 within-session CSP+LDA 准确率（按准确率排序）</w:t>
-      </w:r>
-    </w:p>
-    <w:p>
-      <w:pPr>
-        <w:spacing w:after="120"/>
-      </w:pPr>
-      <w:r>
-        <w:rPr>
-          <w:rFonts w:ascii="Times New Roman" w:hAnsi="Times New Roman" w:eastAsia="宋体"/>
-          <w:b w:val="0"/>
-          <w:sz w:val="22"/>
-        </w:rPr>
-        <w:t>跨天迁移（表 2、图 4）：同一次采集内平均 0.5904；跨天直接迁移降至 0.5255 ± 0.0661（接近随机水平）；加入目标采集前 20% 试次适应后回升至 0.5718 ± 0.1091。配对 Wilcoxon 检验（n=51）：适应 vs 直接迁移 p=1.0e-5（显著提升）；适应 vs 同一次采集内 p=0.019（适应后仍低于同一次采集内）。</w:t>
-      </w:r>
-    </w:p>
-    <w:p>
-      <w:pPr>
-        <w:jc w:val="center"/>
-      </w:pPr>
-      <w:r>
-        <w:drawing>
-          <wp:inline xmlns:a="http://schemas.openxmlformats.org/drawingml/2006/main" xmlns:pic="http://schemas.openxmlformats.org/drawingml/2006/picture">
-            <wp:extent cx="5669280" cy="4049486"/>
-            <wp:docPr id="4" name="Picture 4"/>
-            <wp:cNvGraphicFramePr>
-              <a:graphicFrameLocks noChangeAspect="1"/>
-            </wp:cNvGraphicFramePr>
-            <a:graphic>
-              <a:graphicData uri="http://schemas.openxmlformats.org/drawingml/2006/picture">
-                <pic:pic>
-                  <pic:nvPicPr>
-                    <pic:cNvPr id="0" name="cross_session.png"/>
-                    <pic:cNvPicPr/>
-                  </pic:nvPicPr>
-                  <pic:blipFill>
-                    <a:blip r:embed="rId12"/>
-                    <a:stretch>
-                      <a:fillRect/>
-                    </a:stretch>
-                  </pic:blipFill>
-                  <pic:spPr>
-                    <a:xfrm>
-                      <a:off x="0" y="0"/>
-                      <a:ext cx="5669280" cy="4049486"/>
-                    </a:xfrm>
-                    <a:prstGeom prst="rect"/>
-                  </pic:spPr>
-                </pic:pic>
-              </a:graphicData>
-            </a:graphic>
-          </wp:inline>
-        </w:drawing>
-      </w:r>
-    </w:p>
-    <w:p>
-      <w:pPr>
-        <w:jc w:val="center"/>
-      </w:pPr>
-      <w:r>
-        <w:rPr>
-          <w:rFonts w:eastAsia="宋体"/>
-          <w:sz w:val="18"/>
-        </w:rPr>
-        <w:t>图 4  同一次采集内 vs 跨天直接迁移 vs 跨天+少量适应</w:t>
-      </w:r>
-    </w:p>
-    <w:p>
-      <w:pPr>
-        <w:spacing w:after="120"/>
-      </w:pPr>
-      <w:r>
-        <w:rPr>
-          <w:rFonts w:ascii="Times New Roman" w:hAnsi="Times New Roman" w:eastAsia="宋体"/>
-          <w:b w:val="0"/>
-          <w:sz w:val="22"/>
-        </w:rPr>
-        <w:t>FBCSP 对比（表 3、图 5）：FBCSP+LDA 平均 0.6087 ± 0.1172，高于 CSP+LDA 的 0.5904 ± 0.1220；Wilcoxon 符号秩检验 p = 0.0366，差异具有统计学意义。论文报告的 FBCSP+SVM 为 67.46%。</w:t>
-      </w:r>
-    </w:p>
-    <w:p>
-      <w:pPr>
-        <w:jc w:val="center"/>
-      </w:pPr>
-      <w:r>
-        <w:drawing>
-          <wp:inline xmlns:a="http://schemas.openxmlformats.org/drawingml/2006/main" xmlns:pic="http://schemas.openxmlformats.org/drawingml/2006/picture">
-            <wp:extent cx="5669280" cy="2362200"/>
-            <wp:docPr id="5" name="Picture 5"/>
-            <wp:cNvGraphicFramePr>
-              <a:graphicFrameLocks noChangeAspect="1"/>
-            </wp:cNvGraphicFramePr>
-            <a:graphic>
-              <a:graphicData uri="http://schemas.openxmlformats.org/drawingml/2006/picture">
-                <pic:pic>
-                  <pic:nvPicPr>
-                    <pic:cNvPr id="0" name="fbcsp_vs_csp.png"/>
-                    <pic:cNvPicPr/>
-                  </pic:nvPicPr>
-                  <pic:blipFill>
-                    <a:blip r:embed="rId13"/>
-                    <a:stretch>
-                      <a:fillRect/>
-                    </a:stretch>
-                  </pic:blipFill>
-                  <pic:spPr>
-                    <a:xfrm>
-                      <a:off x="0" y="0"/>
-                      <a:ext cx="5669280" cy="2362200"/>
-                    </a:xfrm>
-                    <a:prstGeom prst="rect"/>
-                  </pic:spPr>
-                </pic:pic>
-              </a:graphicData>
-            </a:graphic>
-          </wp:inline>
-        </w:drawing>
-      </w:r>
-    </w:p>
-    <w:p>
-      <w:pPr>
-        <w:jc w:val="center"/>
-      </w:pPr>
-      <w:r>
-        <w:rPr>
-          <w:rFonts w:eastAsia="宋体"/>
-          <w:sz w:val="18"/>
-        </w:rPr>
-        <w:t>图 5  每名被试 CSP vs FBCSP（配对连线），Wilcoxon p = 0.0366</w:t>
+        <w:t>图 5  群体水平（n=51）对侧 ERD 地形图：mu（左）与 beta（右）频段的“右−左”log 功率差</w:t>
       </w:r>
     </w:p>
     <w:p>
@@ -931,7 +931,7 @@
           <w:b w:val="0"/>
           <w:sz w:val="22"/>
         </w:rPr>
-        <w:t>跨天差异：跨天直接迁移的性能大幅下降（由 0.59 降到 0.53，接近随机），符合 EEG 非平稳性的预期——相隔数日后，电极位置、阻抗、被试生理与注意力状态的变化都会造成特征分布漂移，使旧的空间滤波器失配。而仅用目标采集前 20% 试次重新校准即可显著回补（Wilcoxon p=1.0e-5），但仍未追平同一次采集内（p=0.019），说明“少量当次校准 + 迁移学习”是临床康复 BCI 的可行方向。</w:t>
+        <w:t>跨天差异：跨天直接迁移的性能大幅下降（由 0.59 降到 0.53，接近随机），符合 EEG 非平稳性的预期——相隔数日后，电极位置、阻抗、被试生理与注意力状态的变化都会造成特征分布漂移，使旧的空间滤波器失配。而仅用目标采集前 20% 试次重新校准即可显著回补，说明“少量当次校准”对临床康复 BCI 具有实际意义。</w:t>
       </w:r>
     </w:p>
     <w:p>

</xml_diff>